<commit_message>
feat: paper sau review (ổn)
</commit_message>
<xml_diff>
--- a/papers/Response_to_Reviewers_final.docx
+++ b/papers/Response_to_Reviewers_final.docx
@@ -6,8 +6,14 @@
       <w:pPr>
         <w:pStyle w:val="Heading1"/>
         <w:jc w:val="center"/>
+        <w:rPr>
+          <w:color w:val="auto"/>
+        </w:rPr>
       </w:pPr>
       <w:r>
+        <w:rPr>
+          <w:color w:val="auto"/>
+        </w:rPr>
         <w:t>RESPONSE TO REVIEWERS</w:t>
       </w:r>
     </w:p>
@@ -19,8 +25,14 @@
     <w:p>
       <w:pPr>
         <w:pStyle w:val="Heading2"/>
+        <w:rPr>
+          <w:color w:val="auto"/>
+        </w:rPr>
       </w:pPr>
       <w:r>
+        <w:rPr>
+          <w:color w:val="auto"/>
+        </w:rPr>
         <w:t>Response to Reviewer 1</w:t>
       </w:r>
     </w:p>
@@ -175,7 +187,11 @@
         <w:t xml:space="preserve">Response: </w:t>
       </w:r>
       <w:r>
-        <w:t>Partially addressed, with scope kept truthful. The executed protocol already includes AWGN at 20/10/5/0 dB, MP3 at 128/64 kb/s, Opus at 64 kb/s, AAC at 96 kb/s, and a documented simulated-replay channel, all on the same stratified 100-recording subset. No unseen-attack or full-test stress outputs exist, so they were not fabricated. The manuscript now consistently calls this evidence diagnostic and lists unseen/full-test/physical-replay evaluation as future work.</w:t>
+        <w:t xml:space="preserve">Partially addressed, with scope kept truthful. The executed protocol already includes AWGN at 20/10/5/0 dB, MP3 at 128/64 kb/s, Opus at 64 kb/s, AAC at 96 kb/s, and a documented </w:t>
+      </w:r>
+      <w:r>
+        <w:lastRenderedPageBreak/>
+        <w:t>simulated-replay channel, all on the same stratified 100-recording subset. No unseen-attack or full-test stress outputs exist, so they were not fabricated. The manuscript now consistently calls this evidence diagnostic and lists unseen/full-test/physical-replay evaluation as future work.</w:t>
       </w:r>
     </w:p>
     <w:p>
@@ -183,13 +199,7 @@
         <w:spacing w:after="120"/>
       </w:pPr>
       <w:r>
-        <w:rPr>
-          <w:b/>
-        </w:rPr>
-        <w:t xml:space="preserve">Revision in Manuscript: </w:t>
-      </w:r>
-      <w:r>
-        <w:t>Abstract; Section 3.6; Section 4.2; Section 6, Limitations; Section 7, Conclusion.</w:t>
+        <w:t>Revision in Manuscript: Abstract; Section 3.6; Section 4.2; Section 5.2, Limitations; Section 5.3, Concluding Remarks.</w:t>
       </w:r>
     </w:p>
     <w:p>
@@ -225,13 +235,7 @@
         <w:spacing w:after="120"/>
       </w:pPr>
       <w:r>
-        <w:rPr>
-          <w:b/>
-        </w:rPr>
-        <w:t xml:space="preserve">Revision in Manuscript: </w:t>
-      </w:r>
-      <w:r>
-        <w:t>Section 3.7; Section 4.1; Table 3; Section 6, Limitations; Section 7, Conclusion.</w:t>
+        <w:t>Revision in Manuscript: Section 3.7; Section 4.1; Table 3; Section 5.2, Limitations; Section 5.3, Concluding Remarks.</w:t>
       </w:r>
     </w:p>
     <w:p>
@@ -279,8 +283,14 @@
     <w:p>
       <w:pPr>
         <w:pStyle w:val="Heading2"/>
+        <w:rPr>
+          <w:color w:val="auto"/>
+        </w:rPr>
       </w:pPr>
       <w:r>
+        <w:rPr>
+          <w:color w:val="auto"/>
+        </w:rPr>
         <w:t>Response to Reviewer 2</w:t>
       </w:r>
     </w:p>
@@ -418,6 +428,7 @@
         <w:rPr>
           <w:b/>
         </w:rPr>
+        <w:lastRenderedPageBreak/>
         <w:t xml:space="preserve">Reviewer Comment 3: </w:t>
       </w:r>
       <w:r>
@@ -471,13 +482,7 @@
         <w:spacing w:after="40"/>
       </w:pPr>
       <w:r>
-        <w:rPr>
-          <w:b/>
-        </w:rPr>
-        <w:t xml:space="preserve">Response: </w:t>
-      </w:r>
-      <w:r>
-        <w:t>Fully addressed by moving and consolidating the limitations into a dedicated section immediately before the Conclusion.</w:t>
+        <w:t>Response: Fully addressed by retaining a dedicated Limitations subsection immediately before the concluding remarks within the consolidated Conclusion section.</w:t>
       </w:r>
     </w:p>
     <w:p>
@@ -485,13 +490,7 @@
         <w:spacing w:after="120"/>
       </w:pPr>
       <w:r>
-        <w:rPr>
-          <w:b/>
-        </w:rPr>
-        <w:t xml:space="preserve">Revision in Manuscript: </w:t>
-      </w:r>
-      <w:r>
-        <w:t>Section 6, Limitations.</w:t>
+        <w:t>Revision in Manuscript: Section 5.2, Limitations.</w:t>
       </w:r>
     </w:p>
     <w:p>
@@ -737,20 +736,21 @@
         <w:spacing w:after="120"/>
       </w:pPr>
       <w:r>
-        <w:rPr>
-          <w:b/>
-        </w:rPr>
-        <w:t xml:space="preserve">Revision in Manuscript: </w:t>
-      </w:r>
-      <w:r>
-        <w:t>Section 5, Practical and Societal Implications.</w:t>
+        <w:t>Revision in Manuscript: Section 5.1, Practical and Societal Implications.</w:t>
       </w:r>
     </w:p>
     <w:p>
       <w:pPr>
         <w:pStyle w:val="Heading3"/>
+        <w:rPr>
+          <w:color w:val="auto"/>
+        </w:rPr>
       </w:pPr>
       <w:r>
+        <w:rPr>
+          <w:color w:val="auto"/>
+        </w:rPr>
+        <w:lastRenderedPageBreak/>
         <w:t>Final Remarks</w:t>
       </w:r>
     </w:p>
@@ -760,6 +760,8 @@
       </w:r>
     </w:p>
     <w:sectPr>
+      <w:headerReference w:type="default" r:id="rId8"/>
+      <w:footerReference w:type="default" r:id="rId9"/>
       <w:pgSz w:w="12240" w:h="15840"/>
       <w:pgMar w:top="1440" w:right="1800" w:bottom="1440" w:left="1800" w:header="720" w:footer="720" w:gutter="0"/>
       <w:cols w:space="720"/>
@@ -767,6 +769,76 @@
     </w:sectPr>
   </w:body>
 </w:document>
+</file>
+
+<file path=word/endnotes.xml><?xml version="1.0" encoding="utf-8"?>
+<w:endnotes xmlns:wpc="http://schemas.microsoft.com/office/word/2010/wordprocessingCanvas" xmlns:cx="http://schemas.microsoft.com/office/drawing/2014/chartex" xmlns:cx1="http://schemas.microsoft.com/office/drawing/2015/9/8/chartex" xmlns:cx2="http://schemas.microsoft.com/office/drawing/2015/10/21/chartex" xmlns:cx3="http://schemas.microsoft.com/office/drawing/2016/5/9/chartex" xmlns:cx4="http://schemas.microsoft.com/office/drawing/2016/5/10/chartex" xmlns:cx5="http://schemas.microsoft.com/office/drawing/2016/5/11/chartex" xmlns:cx6="http://schemas.microsoft.com/office/drawing/2016/5/12/chartex" xmlns:cx7="http://schemas.microsoft.com/office/drawing/2016/5/13/chartex" xmlns:cx8="http://schemas.microsoft.com/office/drawing/2016/5/14/chartex" xmlns:mc="http://schemas.openxmlformats.org/markup-compatibility/2006" xmlns:aink="http://schemas.microsoft.com/office/drawing/2016/ink" xmlns:am3d="http://schemas.microsoft.com/office/drawing/2017/model3d" xmlns:o="urn:schemas-microsoft-com:office:office" xmlns:oel="http://schemas.microsoft.com/office/2019/extlst" xmlns:r="http://schemas.openxmlformats.org/officeDocument/2006/relationships" xmlns:m="http://schemas.openxmlformats.org/officeDocument/2006/math" xmlns:v="urn:schemas-microsoft-com:vml" xmlns:wp14="http://schemas.microsoft.com/office/word/2010/wordprocessingDrawing" xmlns:wp="http://schemas.openxmlformats.org/drawingml/2006/wordprocessingDrawing" xmlns:w10="urn:schemas-microsoft-com:office:word" xmlns:w="http://schemas.openxmlformats.org/wordprocessingml/2006/main" xmlns:w14="http://schemas.microsoft.com/office/word/2010/wordml" xmlns:w15="http://schemas.microsoft.com/office/word/2012/wordml" xmlns:w16cex="http://schemas.microsoft.com/office/word/2018/wordml/cex" xmlns:w16cid="http://schemas.microsoft.com/office/word/2016/wordml/cid" xmlns:w16="http://schemas.microsoft.com/office/word/2018/wordml" xmlns:w16du="http://schemas.microsoft.com/office/word/2023/wordml/word16du" xmlns:w16sdtdh="http://schemas.microsoft.com/office/word/2020/wordml/sdtdatahash" xmlns:w16sdtfl="http://schemas.microsoft.com/office/word/2024/wordml/sdtformatlock" xmlns:w16se="http://schemas.microsoft.com/office/word/2015/wordml/symex" xmlns:wpg="http://schemas.microsoft.com/office/word/2010/wordprocessingGroup" xmlns:wpi="http://schemas.microsoft.com/office/word/2010/wordprocessingInk" xmlns:wne="http://schemas.microsoft.com/office/word/2006/wordml" xmlns:wps="http://schemas.microsoft.com/office/word/2010/wordprocessingShape" mc:Ignorable="w14 w15 w16se w16cid w16 w16cex w16sdtdh w16sdtfl w16du wp14">
+  <w:endnote w:type="separator" w:id="-1">
+    <w:p>
+      <w:pPr>
+        <w:spacing w:after="0" w:line="240" w:lineRule="auto"/>
+      </w:pPr>
+      <w:r>
+        <w:separator/>
+      </w:r>
+    </w:p>
+  </w:endnote>
+  <w:endnote w:type="continuationSeparator" w:id="0">
+    <w:p>
+      <w:pPr>
+        <w:spacing w:after="0" w:line="240" w:lineRule="auto"/>
+      </w:pPr>
+      <w:r>
+        <w:continuationSeparator/>
+      </w:r>
+    </w:p>
+  </w:endnote>
+</w:endnotes>
+</file>
+
+<file path=word/footer1.xml><?xml version="1.0" encoding="utf-8"?>
+<w:ftr xmlns:wpc="http://schemas.microsoft.com/office/word/2010/wordprocessingCanvas" xmlns:cx="http://schemas.microsoft.com/office/drawing/2014/chartex" xmlns:cx1="http://schemas.microsoft.com/office/drawing/2015/9/8/chartex" xmlns:cx2="http://schemas.microsoft.com/office/drawing/2015/10/21/chartex" xmlns:cx3="http://schemas.microsoft.com/office/drawing/2016/5/9/chartex" xmlns:cx4="http://schemas.microsoft.com/office/drawing/2016/5/10/chartex" xmlns:cx5="http://schemas.microsoft.com/office/drawing/2016/5/11/chartex" xmlns:cx6="http://schemas.microsoft.com/office/drawing/2016/5/12/chartex" xmlns:cx7="http://schemas.microsoft.com/office/drawing/2016/5/13/chartex" xmlns:cx8="http://schemas.microsoft.com/office/drawing/2016/5/14/chartex" xmlns:mc="http://schemas.openxmlformats.org/markup-compatibility/2006" xmlns:aink="http://schemas.microsoft.com/office/drawing/2016/ink" xmlns:am3d="http://schemas.microsoft.com/office/drawing/2017/model3d" xmlns:o="urn:schemas-microsoft-com:office:office" xmlns:oel="http://schemas.microsoft.com/office/2019/extlst" xmlns:r="http://schemas.openxmlformats.org/officeDocument/2006/relationships" xmlns:m="http://schemas.openxmlformats.org/officeDocument/2006/math" xmlns:v="urn:schemas-microsoft-com:vml" xmlns:wp14="http://schemas.microsoft.com/office/word/2010/wordprocessingDrawing" xmlns:wp="http://schemas.openxmlformats.org/drawingml/2006/wordprocessingDrawing" xmlns:w10="urn:schemas-microsoft-com:office:word" xmlns:w="http://schemas.openxmlformats.org/wordprocessingml/2006/main" xmlns:w14="http://schemas.microsoft.com/office/word/2010/wordml" xmlns:w15="http://schemas.microsoft.com/office/word/2012/wordml" xmlns:w16cex="http://schemas.microsoft.com/office/word/2018/wordml/cex" xmlns:w16cid="http://schemas.microsoft.com/office/word/2016/wordml/cid" xmlns:w16="http://schemas.microsoft.com/office/word/2018/wordml" xmlns:w16du="http://schemas.microsoft.com/office/word/2023/wordml/word16du" xmlns:w16sdtdh="http://schemas.microsoft.com/office/word/2020/wordml/sdtdatahash" xmlns:w16sdtfl="http://schemas.microsoft.com/office/word/2024/wordml/sdtformatlock" xmlns:w16se="http://schemas.microsoft.com/office/word/2015/wordml/symex" xmlns:wpg="http://schemas.microsoft.com/office/word/2010/wordprocessingGroup" xmlns:wpi="http://schemas.microsoft.com/office/word/2010/wordprocessingInk" xmlns:wne="http://schemas.microsoft.com/office/word/2006/wordml" xmlns:wps="http://schemas.microsoft.com/office/word/2010/wordprocessingShape" mc:Ignorable="w14 w15 w16se w16cid w16 w16cex w16sdtdh w16sdtfl w16du wp14">
+  <w:p>
+    <w:pPr>
+      <w:pStyle w:val="Footer"/>
+    </w:pPr>
+  </w:p>
+</w:ftr>
+</file>
+
+<file path=word/footnotes.xml><?xml version="1.0" encoding="utf-8"?>
+<w:footnotes xmlns:wpc="http://schemas.microsoft.com/office/word/2010/wordprocessingCanvas" xmlns:cx="http://schemas.microsoft.com/office/drawing/2014/chartex" xmlns:cx1="http://schemas.microsoft.com/office/drawing/2015/9/8/chartex" xmlns:cx2="http://schemas.microsoft.com/office/drawing/2015/10/21/chartex" xmlns:cx3="http://schemas.microsoft.com/office/drawing/2016/5/9/chartex" xmlns:cx4="http://schemas.microsoft.com/office/drawing/2016/5/10/chartex" xmlns:cx5="http://schemas.microsoft.com/office/drawing/2016/5/11/chartex" xmlns:cx6="http://schemas.microsoft.com/office/drawing/2016/5/12/chartex" xmlns:cx7="http://schemas.microsoft.com/office/drawing/2016/5/13/chartex" xmlns:cx8="http://schemas.microsoft.com/office/drawing/2016/5/14/chartex" xmlns:mc="http://schemas.openxmlformats.org/markup-compatibility/2006" xmlns:aink="http://schemas.microsoft.com/office/drawing/2016/ink" xmlns:am3d="http://schemas.microsoft.com/office/drawing/2017/model3d" xmlns:o="urn:schemas-microsoft-com:office:office" xmlns:oel="http://schemas.microsoft.com/office/2019/extlst" xmlns:r="http://schemas.openxmlformats.org/officeDocument/2006/relationships" xmlns:m="http://schemas.openxmlformats.org/officeDocument/2006/math" xmlns:v="urn:schemas-microsoft-com:vml" xmlns:wp14="http://schemas.microsoft.com/office/word/2010/wordprocessingDrawing" xmlns:wp="http://schemas.openxmlformats.org/drawingml/2006/wordprocessingDrawing" xmlns:w10="urn:schemas-microsoft-com:office:word" xmlns:w="http://schemas.openxmlformats.org/wordprocessingml/2006/main" xmlns:w14="http://schemas.microsoft.com/office/word/2010/wordml" xmlns:w15="http://schemas.microsoft.com/office/word/2012/wordml" xmlns:w16cex="http://schemas.microsoft.com/office/word/2018/wordml/cex" xmlns:w16cid="http://schemas.microsoft.com/office/word/2016/wordml/cid" xmlns:w16="http://schemas.microsoft.com/office/word/2018/wordml" xmlns:w16du="http://schemas.microsoft.com/office/word/2023/wordml/word16du" xmlns:w16sdtdh="http://schemas.microsoft.com/office/word/2020/wordml/sdtdatahash" xmlns:w16sdtfl="http://schemas.microsoft.com/office/word/2024/wordml/sdtformatlock" xmlns:w16se="http://schemas.microsoft.com/office/word/2015/wordml/symex" xmlns:wpg="http://schemas.microsoft.com/office/word/2010/wordprocessingGroup" xmlns:wpi="http://schemas.microsoft.com/office/word/2010/wordprocessingInk" xmlns:wne="http://schemas.microsoft.com/office/word/2006/wordml" xmlns:wps="http://schemas.microsoft.com/office/word/2010/wordprocessingShape" mc:Ignorable="w14 w15 w16se w16cid w16 w16cex w16sdtdh w16sdtfl w16du wp14">
+  <w:footnote w:type="separator" w:id="-1">
+    <w:p>
+      <w:pPr>
+        <w:spacing w:after="0" w:line="240" w:lineRule="auto"/>
+      </w:pPr>
+      <w:r>
+        <w:separator/>
+      </w:r>
+    </w:p>
+  </w:footnote>
+  <w:footnote w:type="continuationSeparator" w:id="0">
+    <w:p>
+      <w:pPr>
+        <w:spacing w:after="0" w:line="240" w:lineRule="auto"/>
+      </w:pPr>
+      <w:r>
+        <w:continuationSeparator/>
+      </w:r>
+    </w:p>
+  </w:footnote>
+</w:footnotes>
+</file>
+
+<file path=word/header1.xml><?xml version="1.0" encoding="utf-8"?>
+<w:hdr xmlns:wpc="http://schemas.microsoft.com/office/word/2010/wordprocessingCanvas" xmlns:cx="http://schemas.microsoft.com/office/drawing/2014/chartex" xmlns:cx1="http://schemas.microsoft.com/office/drawing/2015/9/8/chartex" xmlns:cx2="http://schemas.microsoft.com/office/drawing/2015/10/21/chartex" xmlns:cx3="http://schemas.microsoft.com/office/drawing/2016/5/9/chartex" xmlns:cx4="http://schemas.microsoft.com/office/drawing/2016/5/10/chartex" xmlns:cx5="http://schemas.microsoft.com/office/drawing/2016/5/11/chartex" xmlns:cx6="http://schemas.microsoft.com/office/drawing/2016/5/12/chartex" xmlns:cx7="http://schemas.microsoft.com/office/drawing/2016/5/13/chartex" xmlns:cx8="http://schemas.microsoft.com/office/drawing/2016/5/14/chartex" xmlns:mc="http://schemas.openxmlformats.org/markup-compatibility/2006" xmlns:aink="http://schemas.microsoft.com/office/drawing/2016/ink" xmlns:am3d="http://schemas.microsoft.com/office/drawing/2017/model3d" xmlns:o="urn:schemas-microsoft-com:office:office" xmlns:oel="http://schemas.microsoft.com/office/2019/extlst" xmlns:r="http://schemas.openxmlformats.org/officeDocument/2006/relationships" xmlns:m="http://schemas.openxmlformats.org/officeDocument/2006/math" xmlns:v="urn:schemas-microsoft-com:vml" xmlns:wp14="http://schemas.microsoft.com/office/word/2010/wordprocessingDrawing" xmlns:wp="http://schemas.openxmlformats.org/drawingml/2006/wordprocessingDrawing" xmlns:w10="urn:schemas-microsoft-com:office:word" xmlns:w="http://schemas.openxmlformats.org/wordprocessingml/2006/main" xmlns:w14="http://schemas.microsoft.com/office/word/2010/wordml" xmlns:w15="http://schemas.microsoft.com/office/word/2012/wordml" xmlns:w16cex="http://schemas.microsoft.com/office/word/2018/wordml/cex" xmlns:w16cid="http://schemas.microsoft.com/office/word/2016/wordml/cid" xmlns:w16="http://schemas.microsoft.com/office/word/2018/wordml" xmlns:w16du="http://schemas.microsoft.com/office/word/2023/wordml/word16du" xmlns:w16sdtdh="http://schemas.microsoft.com/office/word/2020/wordml/sdtdatahash" xmlns:w16sdtfl="http://schemas.microsoft.com/office/word/2024/wordml/sdtformatlock" xmlns:w16se="http://schemas.microsoft.com/office/word/2015/wordml/symex" xmlns:wpg="http://schemas.microsoft.com/office/word/2010/wordprocessingGroup" xmlns:wpi="http://schemas.microsoft.com/office/word/2010/wordprocessingInk" xmlns:wne="http://schemas.microsoft.com/office/word/2006/wordml" xmlns:wps="http://schemas.microsoft.com/office/word/2010/wordprocessingShape" mc:Ignorable="w14 w15 w16se w16cid w16 w16cex w16sdtdh w16sdtfl w16du wp14">
+  <w:p>
+    <w:pPr>
+      <w:pStyle w:val="Header"/>
+    </w:pPr>
+  </w:p>
+</w:hdr>
 </file>
 
 <file path=word/numbering.xml><?xml version="1.0" encoding="utf-8"?>
@@ -1602,6 +1674,9 @@
     <w:name w:val="Normal"/>
     <w:qFormat/>
     <w:rsid w:val="00FC693F"/>
+    <w:rPr>
+      <w:rFonts w:ascii="Times New Roman" w:eastAsia="Times New Roman" w:hAnsi="Times New Roman" w:cs="Times New Roman"/>
+    </w:rPr>
   </w:style>
   <w:style w:type="paragraph" w:styleId="Heading1">
     <w:name w:val="heading 1"/>
@@ -1618,7 +1693,6 @@
       <w:outlineLvl w:val="0"/>
     </w:pPr>
     <w:rPr>
-      <w:rFonts w:asciiTheme="majorHAnsi" w:eastAsiaTheme="majorEastAsia" w:hAnsiTheme="majorHAnsi" w:cstheme="majorBidi"/>
       <w:b/>
       <w:bCs/>
       <w:color w:val="365F91" w:themeColor="accent1" w:themeShade="BF"/>
@@ -1642,7 +1716,6 @@
       <w:outlineLvl w:val="1"/>
     </w:pPr>
     <w:rPr>
-      <w:rFonts w:asciiTheme="majorHAnsi" w:eastAsiaTheme="majorEastAsia" w:hAnsiTheme="majorHAnsi" w:cstheme="majorBidi"/>
       <w:b/>
       <w:bCs/>
       <w:color w:val="4F81BD" w:themeColor="accent1"/>
@@ -1666,7 +1739,6 @@
       <w:outlineLvl w:val="2"/>
     </w:pPr>
     <w:rPr>
-      <w:rFonts w:asciiTheme="majorHAnsi" w:eastAsiaTheme="majorEastAsia" w:hAnsiTheme="majorHAnsi" w:cstheme="majorBidi"/>
       <w:b/>
       <w:bCs/>
       <w:color w:val="4F81BD" w:themeColor="accent1"/>
@@ -1689,7 +1761,6 @@
       <w:outlineLvl w:val="3"/>
     </w:pPr>
     <w:rPr>
-      <w:rFonts w:asciiTheme="majorHAnsi" w:eastAsiaTheme="majorEastAsia" w:hAnsiTheme="majorHAnsi" w:cstheme="majorBidi"/>
       <w:b/>
       <w:bCs/>
       <w:i/>
@@ -1714,7 +1785,6 @@
       <w:outlineLvl w:val="4"/>
     </w:pPr>
     <w:rPr>
-      <w:rFonts w:asciiTheme="majorHAnsi" w:eastAsiaTheme="majorEastAsia" w:hAnsiTheme="majorHAnsi" w:cstheme="majorBidi"/>
       <w:color w:val="243F60" w:themeColor="accent1" w:themeShade="7F"/>
     </w:rPr>
   </w:style>
@@ -1735,7 +1805,6 @@
       <w:outlineLvl w:val="5"/>
     </w:pPr>
     <w:rPr>
-      <w:rFonts w:asciiTheme="majorHAnsi" w:eastAsiaTheme="majorEastAsia" w:hAnsiTheme="majorHAnsi" w:cstheme="majorBidi"/>
       <w:i/>
       <w:iCs/>
       <w:color w:val="243F60" w:themeColor="accent1" w:themeShade="7F"/>
@@ -1758,7 +1827,6 @@
       <w:outlineLvl w:val="6"/>
     </w:pPr>
     <w:rPr>
-      <w:rFonts w:asciiTheme="majorHAnsi" w:eastAsiaTheme="majorEastAsia" w:hAnsiTheme="majorHAnsi" w:cstheme="majorBidi"/>
       <w:i/>
       <w:iCs/>
       <w:color w:val="404040" w:themeColor="text1" w:themeTint="BF"/>
@@ -1781,7 +1849,6 @@
       <w:outlineLvl w:val="7"/>
     </w:pPr>
     <w:rPr>
-      <w:rFonts w:asciiTheme="majorHAnsi" w:eastAsiaTheme="majorEastAsia" w:hAnsiTheme="majorHAnsi" w:cstheme="majorBidi"/>
       <w:color w:val="4F81BD" w:themeColor="accent1"/>
       <w:sz w:val="20"/>
       <w:szCs w:val="20"/>
@@ -1804,7 +1871,6 @@
       <w:outlineLvl w:val="8"/>
     </w:pPr>
     <w:rPr>
-      <w:rFonts w:asciiTheme="majorHAnsi" w:eastAsiaTheme="majorEastAsia" w:hAnsiTheme="majorHAnsi" w:cstheme="majorBidi"/>
       <w:i/>
       <w:iCs/>
       <w:color w:val="404040" w:themeColor="text1" w:themeTint="BF"/>
@@ -1815,6 +1881,7 @@
   <w:style w:type="character" w:default="1" w:styleId="DefaultParagraphFont">
     <w:name w:val="Default Paragraph Font"/>
     <w:uiPriority w:val="1"/>
+    <w:semiHidden/>
     <w:unhideWhenUsed/>
   </w:style>
   <w:style w:type="table" w:default="1" w:styleId="TableNormal">
@@ -1859,6 +1926,9 @@
     <w:link w:val="Header"/>
     <w:uiPriority w:val="99"/>
     <w:rsid w:val="00E618BF"/>
+    <w:rPr>
+      <w:rFonts w:ascii="Times New Roman" w:eastAsia="Times New Roman" w:hAnsi="Times New Roman" w:cs="Times New Roman"/>
+    </w:rPr>
   </w:style>
   <w:style w:type="paragraph" w:styleId="Footer">
     <w:name w:val="footer"/>
@@ -1881,6 +1951,9 @@
     <w:link w:val="Footer"/>
     <w:uiPriority w:val="99"/>
     <w:rsid w:val="00E618BF"/>
+    <w:rPr>
+      <w:rFonts w:ascii="Times New Roman" w:eastAsia="Times New Roman" w:hAnsi="Times New Roman" w:cs="Times New Roman"/>
+    </w:rPr>
   </w:style>
   <w:style w:type="paragraph" w:styleId="NoSpacing">
     <w:name w:val="No Spacing"/>
@@ -1890,6 +1963,9 @@
     <w:pPr>
       <w:spacing w:after="0" w:line="240" w:lineRule="auto"/>
     </w:pPr>
+    <w:rPr>
+      <w:rFonts w:ascii="Times New Roman" w:eastAsia="Times New Roman" w:hAnsi="Times New Roman" w:cs="Times New Roman"/>
+    </w:rPr>
   </w:style>
   <w:style w:type="character" w:customStyle="1" w:styleId="Heading1Char">
     <w:name w:val="Heading 1 Char"/>
@@ -1898,7 +1974,7 @@
     <w:uiPriority w:val="9"/>
     <w:rsid w:val="00FC693F"/>
     <w:rPr>
-      <w:rFonts w:asciiTheme="majorHAnsi" w:eastAsiaTheme="majorEastAsia" w:hAnsiTheme="majorHAnsi" w:cstheme="majorBidi"/>
+      <w:rFonts w:ascii="Times New Roman" w:eastAsia="Times New Roman" w:hAnsi="Times New Roman" w:cs="Times New Roman"/>
       <w:b/>
       <w:bCs/>
       <w:color w:val="365F91" w:themeColor="accent1" w:themeShade="BF"/>
@@ -1913,7 +1989,7 @@
     <w:uiPriority w:val="9"/>
     <w:rsid w:val="00FC693F"/>
     <w:rPr>
-      <w:rFonts w:asciiTheme="majorHAnsi" w:eastAsiaTheme="majorEastAsia" w:hAnsiTheme="majorHAnsi" w:cstheme="majorBidi"/>
+      <w:rFonts w:ascii="Times New Roman" w:eastAsia="Times New Roman" w:hAnsi="Times New Roman" w:cs="Times New Roman"/>
       <w:b/>
       <w:bCs/>
       <w:color w:val="4F81BD" w:themeColor="accent1"/>
@@ -1928,7 +2004,7 @@
     <w:uiPriority w:val="9"/>
     <w:rsid w:val="00FC693F"/>
     <w:rPr>
-      <w:rFonts w:asciiTheme="majorHAnsi" w:eastAsiaTheme="majorEastAsia" w:hAnsiTheme="majorHAnsi" w:cstheme="majorBidi"/>
+      <w:rFonts w:ascii="Times New Roman" w:eastAsia="Times New Roman" w:hAnsi="Times New Roman" w:cs="Times New Roman"/>
       <w:b/>
       <w:bCs/>
       <w:color w:val="4F81BD" w:themeColor="accent1"/>
@@ -1950,7 +2026,6 @@
       <w:contextualSpacing/>
     </w:pPr>
     <w:rPr>
-      <w:rFonts w:asciiTheme="majorHAnsi" w:eastAsiaTheme="majorEastAsia" w:hAnsiTheme="majorHAnsi" w:cstheme="majorBidi"/>
       <w:color w:val="17365D" w:themeColor="text2" w:themeShade="BF"/>
       <w:spacing w:val="5"/>
       <w:kern w:val="28"/>
@@ -1965,7 +2040,7 @@
     <w:uiPriority w:val="10"/>
     <w:rsid w:val="00FC693F"/>
     <w:rPr>
-      <w:rFonts w:asciiTheme="majorHAnsi" w:eastAsiaTheme="majorEastAsia" w:hAnsiTheme="majorHAnsi" w:cstheme="majorBidi"/>
+      <w:rFonts w:ascii="Times New Roman" w:eastAsia="Times New Roman" w:hAnsi="Times New Roman" w:cs="Times New Roman"/>
       <w:color w:val="17365D" w:themeColor="text2" w:themeShade="BF"/>
       <w:spacing w:val="5"/>
       <w:kern w:val="28"/>
@@ -1987,7 +2062,6 @@
       </w:numPr>
     </w:pPr>
     <w:rPr>
-      <w:rFonts w:asciiTheme="majorHAnsi" w:eastAsiaTheme="majorEastAsia" w:hAnsiTheme="majorHAnsi" w:cstheme="majorBidi"/>
       <w:i/>
       <w:iCs/>
       <w:color w:val="4F81BD" w:themeColor="accent1"/>
@@ -2003,7 +2077,7 @@
     <w:uiPriority w:val="11"/>
     <w:rsid w:val="00FC693F"/>
     <w:rPr>
-      <w:rFonts w:asciiTheme="majorHAnsi" w:eastAsiaTheme="majorEastAsia" w:hAnsiTheme="majorHAnsi" w:cstheme="majorBidi"/>
+      <w:rFonts w:ascii="Times New Roman" w:eastAsia="Times New Roman" w:hAnsi="Times New Roman" w:cs="Times New Roman"/>
       <w:i/>
       <w:iCs/>
       <w:color w:val="4F81BD" w:themeColor="accent1"/>
@@ -2040,6 +2114,9 @@
     <w:link w:val="BodyText"/>
     <w:uiPriority w:val="99"/>
     <w:rsid w:val="00AA1D8D"/>
+    <w:rPr>
+      <w:rFonts w:ascii="Times New Roman" w:eastAsia="Times New Roman" w:hAnsi="Times New Roman" w:cs="Times New Roman"/>
+    </w:rPr>
   </w:style>
   <w:style w:type="paragraph" w:styleId="BodyText2">
     <w:name w:val="Body Text 2"/>
@@ -2058,6 +2135,9 @@
     <w:link w:val="BodyText2"/>
     <w:uiPriority w:val="99"/>
     <w:rsid w:val="00AA1D8D"/>
+    <w:rPr>
+      <w:rFonts w:ascii="Times New Roman" w:eastAsia="Times New Roman" w:hAnsi="Times New Roman" w:cs="Times New Roman"/>
+    </w:rPr>
   </w:style>
   <w:style w:type="paragraph" w:styleId="BodyText3">
     <w:name w:val="Body Text 3"/>
@@ -2081,6 +2161,7 @@
     <w:uiPriority w:val="99"/>
     <w:rsid w:val="00AA1D8D"/>
     <w:rPr>
+      <w:rFonts w:ascii="Times New Roman" w:eastAsia="Times New Roman" w:hAnsi="Times New Roman" w:cs="Times New Roman"/>
       <w:sz w:val="16"/>
       <w:szCs w:val="16"/>
     </w:rPr>
@@ -2250,7 +2331,7 @@
       </w:tabs>
     </w:pPr>
     <w:rPr>
-      <w:rFonts w:ascii="Courier" w:hAnsi="Courier"/>
+      <w:rFonts w:ascii="Times New Roman" w:eastAsia="Times New Roman" w:hAnsi="Times New Roman" w:cs="Times New Roman"/>
       <w:sz w:val="20"/>
       <w:szCs w:val="20"/>
     </w:rPr>
@@ -2262,7 +2343,7 @@
     <w:uiPriority w:val="99"/>
     <w:rsid w:val="0029639D"/>
     <w:rPr>
-      <w:rFonts w:ascii="Courier" w:hAnsi="Courier"/>
+      <w:rFonts w:ascii="Times New Roman" w:eastAsia="Times New Roman" w:hAnsi="Times New Roman" w:cs="Times New Roman"/>
       <w:sz w:val="20"/>
       <w:szCs w:val="20"/>
     </w:rPr>
@@ -2288,6 +2369,7 @@
     <w:uiPriority w:val="29"/>
     <w:rsid w:val="00FC693F"/>
     <w:rPr>
+      <w:rFonts w:ascii="Times New Roman" w:eastAsia="Times New Roman" w:hAnsi="Times New Roman" w:cs="Times New Roman"/>
       <w:i/>
       <w:iCs/>
       <w:color w:val="000000" w:themeColor="text1"/>
@@ -2301,7 +2383,7 @@
     <w:semiHidden/>
     <w:rsid w:val="00FC693F"/>
     <w:rPr>
-      <w:rFonts w:asciiTheme="majorHAnsi" w:eastAsiaTheme="majorEastAsia" w:hAnsiTheme="majorHAnsi" w:cstheme="majorBidi"/>
+      <w:rFonts w:ascii="Times New Roman" w:eastAsia="Times New Roman" w:hAnsi="Times New Roman" w:cs="Times New Roman"/>
       <w:b/>
       <w:bCs/>
       <w:i/>
@@ -2317,7 +2399,7 @@
     <w:semiHidden/>
     <w:rsid w:val="00FC693F"/>
     <w:rPr>
-      <w:rFonts w:asciiTheme="majorHAnsi" w:eastAsiaTheme="majorEastAsia" w:hAnsiTheme="majorHAnsi" w:cstheme="majorBidi"/>
+      <w:rFonts w:ascii="Times New Roman" w:eastAsia="Times New Roman" w:hAnsi="Times New Roman" w:cs="Times New Roman"/>
       <w:color w:val="243F60" w:themeColor="accent1" w:themeShade="7F"/>
     </w:rPr>
   </w:style>
@@ -2329,7 +2411,7 @@
     <w:semiHidden/>
     <w:rsid w:val="00FC693F"/>
     <w:rPr>
-      <w:rFonts w:asciiTheme="majorHAnsi" w:eastAsiaTheme="majorEastAsia" w:hAnsiTheme="majorHAnsi" w:cstheme="majorBidi"/>
+      <w:rFonts w:ascii="Times New Roman" w:eastAsia="Times New Roman" w:hAnsi="Times New Roman" w:cs="Times New Roman"/>
       <w:i/>
       <w:iCs/>
       <w:color w:val="243F60" w:themeColor="accent1" w:themeShade="7F"/>
@@ -2343,7 +2425,7 @@
     <w:semiHidden/>
     <w:rsid w:val="00FC693F"/>
     <w:rPr>
-      <w:rFonts w:asciiTheme="majorHAnsi" w:eastAsiaTheme="majorEastAsia" w:hAnsiTheme="majorHAnsi" w:cstheme="majorBidi"/>
+      <w:rFonts w:ascii="Times New Roman" w:eastAsia="Times New Roman" w:hAnsi="Times New Roman" w:cs="Times New Roman"/>
       <w:i/>
       <w:iCs/>
       <w:color w:val="404040" w:themeColor="text1" w:themeTint="BF"/>
@@ -2357,7 +2439,7 @@
     <w:semiHidden/>
     <w:rsid w:val="00FC693F"/>
     <w:rPr>
-      <w:rFonts w:asciiTheme="majorHAnsi" w:eastAsiaTheme="majorEastAsia" w:hAnsiTheme="majorHAnsi" w:cstheme="majorBidi"/>
+      <w:rFonts w:ascii="Times New Roman" w:eastAsia="Times New Roman" w:hAnsi="Times New Roman" w:cs="Times New Roman"/>
       <w:color w:val="4F81BD" w:themeColor="accent1"/>
       <w:sz w:val="20"/>
       <w:szCs w:val="20"/>
@@ -2371,7 +2453,7 @@
     <w:semiHidden/>
     <w:rsid w:val="00FC693F"/>
     <w:rPr>
-      <w:rFonts w:asciiTheme="majorHAnsi" w:eastAsiaTheme="majorEastAsia" w:hAnsiTheme="majorHAnsi" w:cstheme="majorBidi"/>
+      <w:rFonts w:ascii="Times New Roman" w:eastAsia="Times New Roman" w:hAnsi="Times New Roman" w:cs="Times New Roman"/>
       <w:i/>
       <w:iCs/>
       <w:color w:val="404040" w:themeColor="text1" w:themeTint="BF"/>
@@ -2406,6 +2488,7 @@
     <w:qFormat/>
     <w:rsid w:val="00FC693F"/>
     <w:rPr>
+      <w:rFonts w:ascii="Times New Roman" w:eastAsia="Times New Roman" w:hAnsi="Times New Roman" w:cs="Times New Roman"/>
       <w:b/>
       <w:bCs/>
     </w:rPr>
@@ -2417,6 +2500,7 @@
     <w:qFormat/>
     <w:rsid w:val="00FC693F"/>
     <w:rPr>
+      <w:rFonts w:ascii="Times New Roman" w:eastAsia="Times New Roman" w:hAnsi="Times New Roman" w:cs="Times New Roman"/>
       <w:i/>
       <w:iCs/>
     </w:rPr>
@@ -2451,6 +2535,7 @@
     <w:uiPriority w:val="30"/>
     <w:rsid w:val="00FC693F"/>
     <w:rPr>
+      <w:rFonts w:ascii="Times New Roman" w:eastAsia="Times New Roman" w:hAnsi="Times New Roman" w:cs="Times New Roman"/>
       <w:b/>
       <w:bCs/>
       <w:i/>
@@ -2465,6 +2550,7 @@
     <w:qFormat/>
     <w:rsid w:val="00FC693F"/>
     <w:rPr>
+      <w:rFonts w:ascii="Times New Roman" w:eastAsia="Times New Roman" w:hAnsi="Times New Roman" w:cs="Times New Roman"/>
       <w:i/>
       <w:iCs/>
       <w:color w:val="808080" w:themeColor="text1" w:themeTint="7F"/>
@@ -2477,6 +2563,7 @@
     <w:qFormat/>
     <w:rsid w:val="00FC693F"/>
     <w:rPr>
+      <w:rFonts w:ascii="Times New Roman" w:eastAsia="Times New Roman" w:hAnsi="Times New Roman" w:cs="Times New Roman"/>
       <w:b/>
       <w:bCs/>
       <w:i/>
@@ -2491,6 +2578,7 @@
     <w:qFormat/>
     <w:rsid w:val="00FC693F"/>
     <w:rPr>
+      <w:rFonts w:ascii="Times New Roman" w:eastAsia="Times New Roman" w:hAnsi="Times New Roman" w:cs="Times New Roman"/>
       <w:smallCaps/>
       <w:color w:val="C0504D" w:themeColor="accent2"/>
       <w:u w:val="single"/>
@@ -2503,6 +2591,7 @@
     <w:qFormat/>
     <w:rsid w:val="00FC693F"/>
     <w:rPr>
+      <w:rFonts w:ascii="Times New Roman" w:eastAsia="Times New Roman" w:hAnsi="Times New Roman" w:cs="Times New Roman"/>
       <w:b/>
       <w:bCs/>
       <w:smallCaps/>
@@ -2518,6 +2607,7 @@
     <w:qFormat/>
     <w:rsid w:val="00FC693F"/>
     <w:rPr>
+      <w:rFonts w:ascii="Times New Roman" w:eastAsia="Times New Roman" w:hAnsi="Times New Roman" w:cs="Times New Roman"/>
       <w:b/>
       <w:bCs/>
       <w:smallCaps/>
@@ -2545,6 +2635,9 @@
     <w:pPr>
       <w:spacing w:after="0" w:line="240" w:lineRule="auto"/>
     </w:pPr>
+    <w:rPr>
+      <w:rFonts w:ascii="Times New Roman" w:eastAsia="Times New Roman" w:hAnsi="Times New Roman" w:cs="Times New Roman"/>
+    </w:rPr>
     <w:tblPr>
       <w:tblBorders>
         <w:top w:val="single" w:sz="4" w:space="0" w:color="auto"/>
@@ -2565,6 +2658,7 @@
       <w:spacing w:after="0" w:line="240" w:lineRule="auto"/>
     </w:pPr>
     <w:rPr>
+      <w:rFonts w:ascii="Times New Roman" w:eastAsia="Times New Roman" w:hAnsi="Times New Roman" w:cs="Times New Roman"/>
       <w:color w:val="000000" w:themeColor="text1" w:themeShade="BF"/>
     </w:rPr>
     <w:tblPr>
@@ -2661,6 +2755,7 @@
       <w:spacing w:after="0" w:line="240" w:lineRule="auto"/>
     </w:pPr>
     <w:rPr>
+      <w:rFonts w:ascii="Times New Roman" w:eastAsia="Times New Roman" w:hAnsi="Times New Roman" w:cs="Times New Roman"/>
       <w:color w:val="365F91" w:themeColor="accent1" w:themeShade="BF"/>
     </w:rPr>
     <w:tblPr>
@@ -2757,6 +2852,7 @@
       <w:spacing w:after="0" w:line="240" w:lineRule="auto"/>
     </w:pPr>
     <w:rPr>
+      <w:rFonts w:ascii="Times New Roman" w:eastAsia="Times New Roman" w:hAnsi="Times New Roman" w:cs="Times New Roman"/>
       <w:color w:val="943634" w:themeColor="accent2" w:themeShade="BF"/>
     </w:rPr>
     <w:tblPr>
@@ -2853,6 +2949,7 @@
       <w:spacing w:after="0" w:line="240" w:lineRule="auto"/>
     </w:pPr>
     <w:rPr>
+      <w:rFonts w:ascii="Times New Roman" w:eastAsia="Times New Roman" w:hAnsi="Times New Roman" w:cs="Times New Roman"/>
       <w:color w:val="76923C" w:themeColor="accent3" w:themeShade="BF"/>
     </w:rPr>
     <w:tblPr>
@@ -2949,6 +3046,7 @@
       <w:spacing w:after="0" w:line="240" w:lineRule="auto"/>
     </w:pPr>
     <w:rPr>
+      <w:rFonts w:ascii="Times New Roman" w:eastAsia="Times New Roman" w:hAnsi="Times New Roman" w:cs="Times New Roman"/>
       <w:color w:val="5F497A" w:themeColor="accent4" w:themeShade="BF"/>
     </w:rPr>
     <w:tblPr>
@@ -3045,6 +3143,7 @@
       <w:spacing w:after="0" w:line="240" w:lineRule="auto"/>
     </w:pPr>
     <w:rPr>
+      <w:rFonts w:ascii="Times New Roman" w:eastAsia="Times New Roman" w:hAnsi="Times New Roman" w:cs="Times New Roman"/>
       <w:color w:val="31849B" w:themeColor="accent5" w:themeShade="BF"/>
     </w:rPr>
     <w:tblPr>
@@ -3141,6 +3240,7 @@
       <w:spacing w:after="0" w:line="240" w:lineRule="auto"/>
     </w:pPr>
     <w:rPr>
+      <w:rFonts w:ascii="Times New Roman" w:eastAsia="Times New Roman" w:hAnsi="Times New Roman" w:cs="Times New Roman"/>
       <w:color w:val="E36C0A" w:themeColor="accent6" w:themeShade="BF"/>
     </w:rPr>
     <w:tblPr>
@@ -3236,6 +3336,9 @@
     <w:pPr>
       <w:spacing w:after="0" w:line="240" w:lineRule="auto"/>
     </w:pPr>
+    <w:rPr>
+      <w:rFonts w:ascii="Times New Roman" w:eastAsia="Times New Roman" w:hAnsi="Times New Roman" w:cs="Times New Roman"/>
+    </w:rPr>
     <w:tblPr>
       <w:tblStyleRowBandSize w:val="1"/>
       <w:tblStyleColBandSize w:val="1"/>
@@ -3321,6 +3424,9 @@
     <w:pPr>
       <w:spacing w:after="0" w:line="240" w:lineRule="auto"/>
     </w:pPr>
+    <w:rPr>
+      <w:rFonts w:ascii="Times New Roman" w:eastAsia="Times New Roman" w:hAnsi="Times New Roman" w:cs="Times New Roman"/>
+    </w:rPr>
     <w:tblPr>
       <w:tblStyleRowBandSize w:val="1"/>
       <w:tblStyleColBandSize w:val="1"/>
@@ -3406,6 +3512,9 @@
     <w:pPr>
       <w:spacing w:after="0" w:line="240" w:lineRule="auto"/>
     </w:pPr>
+    <w:rPr>
+      <w:rFonts w:ascii="Times New Roman" w:eastAsia="Times New Roman" w:hAnsi="Times New Roman" w:cs="Times New Roman"/>
+    </w:rPr>
     <w:tblPr>
       <w:tblStyleRowBandSize w:val="1"/>
       <w:tblStyleColBandSize w:val="1"/>
@@ -3491,6 +3600,9 @@
     <w:pPr>
       <w:spacing w:after="0" w:line="240" w:lineRule="auto"/>
     </w:pPr>
+    <w:rPr>
+      <w:rFonts w:ascii="Times New Roman" w:eastAsia="Times New Roman" w:hAnsi="Times New Roman" w:cs="Times New Roman"/>
+    </w:rPr>
     <w:tblPr>
       <w:tblStyleRowBandSize w:val="1"/>
       <w:tblStyleColBandSize w:val="1"/>
@@ -3576,6 +3688,9 @@
     <w:pPr>
       <w:spacing w:after="0" w:line="240" w:lineRule="auto"/>
     </w:pPr>
+    <w:rPr>
+      <w:rFonts w:ascii="Times New Roman" w:eastAsia="Times New Roman" w:hAnsi="Times New Roman" w:cs="Times New Roman"/>
+    </w:rPr>
     <w:tblPr>
       <w:tblStyleRowBandSize w:val="1"/>
       <w:tblStyleColBandSize w:val="1"/>
@@ -3661,6 +3776,9 @@
     <w:pPr>
       <w:spacing w:after="0" w:line="240" w:lineRule="auto"/>
     </w:pPr>
+    <w:rPr>
+      <w:rFonts w:ascii="Times New Roman" w:eastAsia="Times New Roman" w:hAnsi="Times New Roman" w:cs="Times New Roman"/>
+    </w:rPr>
     <w:tblPr>
       <w:tblStyleRowBandSize w:val="1"/>
       <w:tblStyleColBandSize w:val="1"/>
@@ -3746,6 +3864,9 @@
     <w:pPr>
       <w:spacing w:after="0" w:line="240" w:lineRule="auto"/>
     </w:pPr>
+    <w:rPr>
+      <w:rFonts w:ascii="Times New Roman" w:eastAsia="Times New Roman" w:hAnsi="Times New Roman" w:cs="Times New Roman"/>
+    </w:rPr>
     <w:tblPr>
       <w:tblStyleRowBandSize w:val="1"/>
       <w:tblStyleColBandSize w:val="1"/>
@@ -3831,6 +3952,9 @@
     <w:pPr>
       <w:spacing w:after="0" w:line="240" w:lineRule="auto"/>
     </w:pPr>
+    <w:rPr>
+      <w:rFonts w:ascii="Times New Roman" w:eastAsia="Times New Roman" w:hAnsi="Times New Roman" w:cs="Times New Roman"/>
+    </w:rPr>
     <w:tblPr>
       <w:tblStyleRowBandSize w:val="1"/>
       <w:tblStyleColBandSize w:val="1"/>
@@ -3954,6 +4078,9 @@
     <w:pPr>
       <w:spacing w:after="0" w:line="240" w:lineRule="auto"/>
     </w:pPr>
+    <w:rPr>
+      <w:rFonts w:ascii="Times New Roman" w:eastAsia="Times New Roman" w:hAnsi="Times New Roman" w:cs="Times New Roman"/>
+    </w:rPr>
     <w:tblPr>
       <w:tblStyleRowBandSize w:val="1"/>
       <w:tblStyleColBandSize w:val="1"/>
@@ -4077,6 +4204,9 @@
     <w:pPr>
       <w:spacing w:after="0" w:line="240" w:lineRule="auto"/>
     </w:pPr>
+    <w:rPr>
+      <w:rFonts w:ascii="Times New Roman" w:eastAsia="Times New Roman" w:hAnsi="Times New Roman" w:cs="Times New Roman"/>
+    </w:rPr>
     <w:tblPr>
       <w:tblStyleRowBandSize w:val="1"/>
       <w:tblStyleColBandSize w:val="1"/>
@@ -4200,6 +4330,9 @@
     <w:pPr>
       <w:spacing w:after="0" w:line="240" w:lineRule="auto"/>
     </w:pPr>
+    <w:rPr>
+      <w:rFonts w:ascii="Times New Roman" w:eastAsia="Times New Roman" w:hAnsi="Times New Roman" w:cs="Times New Roman"/>
+    </w:rPr>
     <w:tblPr>
       <w:tblStyleRowBandSize w:val="1"/>
       <w:tblStyleColBandSize w:val="1"/>
@@ -4323,6 +4456,9 @@
     <w:pPr>
       <w:spacing w:after="0" w:line="240" w:lineRule="auto"/>
     </w:pPr>
+    <w:rPr>
+      <w:rFonts w:ascii="Times New Roman" w:eastAsia="Times New Roman" w:hAnsi="Times New Roman" w:cs="Times New Roman"/>
+    </w:rPr>
     <w:tblPr>
       <w:tblStyleRowBandSize w:val="1"/>
       <w:tblStyleColBandSize w:val="1"/>
@@ -4446,6 +4582,9 @@
     <w:pPr>
       <w:spacing w:after="0" w:line="240" w:lineRule="auto"/>
     </w:pPr>
+    <w:rPr>
+      <w:rFonts w:ascii="Times New Roman" w:eastAsia="Times New Roman" w:hAnsi="Times New Roman" w:cs="Times New Roman"/>
+    </w:rPr>
     <w:tblPr>
       <w:tblStyleRowBandSize w:val="1"/>
       <w:tblStyleColBandSize w:val="1"/>
@@ -4569,6 +4708,9 @@
     <w:pPr>
       <w:spacing w:after="0" w:line="240" w:lineRule="auto"/>
     </w:pPr>
+    <w:rPr>
+      <w:rFonts w:ascii="Times New Roman" w:eastAsia="Times New Roman" w:hAnsi="Times New Roman" w:cs="Times New Roman"/>
+    </w:rPr>
     <w:tblPr>
       <w:tblStyleRowBandSize w:val="1"/>
       <w:tblStyleColBandSize w:val="1"/>
@@ -4692,6 +4834,9 @@
     <w:pPr>
       <w:spacing w:after="0" w:line="240" w:lineRule="auto"/>
     </w:pPr>
+    <w:rPr>
+      <w:rFonts w:ascii="Times New Roman" w:eastAsia="Times New Roman" w:hAnsi="Times New Roman" w:cs="Times New Roman"/>
+    </w:rPr>
     <w:tblPr>
       <w:tblStyleRowBandSize w:val="1"/>
       <w:tblStyleColBandSize w:val="1"/>
@@ -4791,6 +4936,9 @@
     <w:pPr>
       <w:spacing w:after="0" w:line="240" w:lineRule="auto"/>
     </w:pPr>
+    <w:rPr>
+      <w:rFonts w:ascii="Times New Roman" w:eastAsia="Times New Roman" w:hAnsi="Times New Roman" w:cs="Times New Roman"/>
+    </w:rPr>
     <w:tblPr>
       <w:tblStyleRowBandSize w:val="1"/>
       <w:tblStyleColBandSize w:val="1"/>
@@ -4890,6 +5038,9 @@
     <w:pPr>
       <w:spacing w:after="0" w:line="240" w:lineRule="auto"/>
     </w:pPr>
+    <w:rPr>
+      <w:rFonts w:ascii="Times New Roman" w:eastAsia="Times New Roman" w:hAnsi="Times New Roman" w:cs="Times New Roman"/>
+    </w:rPr>
     <w:tblPr>
       <w:tblStyleRowBandSize w:val="1"/>
       <w:tblStyleColBandSize w:val="1"/>
@@ -4989,6 +5140,9 @@
     <w:pPr>
       <w:spacing w:after="0" w:line="240" w:lineRule="auto"/>
     </w:pPr>
+    <w:rPr>
+      <w:rFonts w:ascii="Times New Roman" w:eastAsia="Times New Roman" w:hAnsi="Times New Roman" w:cs="Times New Roman"/>
+    </w:rPr>
     <w:tblPr>
       <w:tblStyleRowBandSize w:val="1"/>
       <w:tblStyleColBandSize w:val="1"/>
@@ -5088,6 +5242,9 @@
     <w:pPr>
       <w:spacing w:after="0" w:line="240" w:lineRule="auto"/>
     </w:pPr>
+    <w:rPr>
+      <w:rFonts w:ascii="Times New Roman" w:eastAsia="Times New Roman" w:hAnsi="Times New Roman" w:cs="Times New Roman"/>
+    </w:rPr>
     <w:tblPr>
       <w:tblStyleRowBandSize w:val="1"/>
       <w:tblStyleColBandSize w:val="1"/>
@@ -5187,6 +5344,9 @@
     <w:pPr>
       <w:spacing w:after="0" w:line="240" w:lineRule="auto"/>
     </w:pPr>
+    <w:rPr>
+      <w:rFonts w:ascii="Times New Roman" w:eastAsia="Times New Roman" w:hAnsi="Times New Roman" w:cs="Times New Roman"/>
+    </w:rPr>
     <w:tblPr>
       <w:tblStyleRowBandSize w:val="1"/>
       <w:tblStyleColBandSize w:val="1"/>
@@ -5286,6 +5446,9 @@
     <w:pPr>
       <w:spacing w:after="0" w:line="240" w:lineRule="auto"/>
     </w:pPr>
+    <w:rPr>
+      <w:rFonts w:ascii="Times New Roman" w:eastAsia="Times New Roman" w:hAnsi="Times New Roman" w:cs="Times New Roman"/>
+    </w:rPr>
     <w:tblPr>
       <w:tblStyleRowBandSize w:val="1"/>
       <w:tblStyleColBandSize w:val="1"/>
@@ -5385,6 +5548,9 @@
     <w:pPr>
       <w:spacing w:after="0" w:line="240" w:lineRule="auto"/>
     </w:pPr>
+    <w:rPr>
+      <w:rFonts w:ascii="Times New Roman" w:eastAsia="Times New Roman" w:hAnsi="Times New Roman" w:cs="Times New Roman"/>
+    </w:rPr>
     <w:tblPr>
       <w:tblStyleRowBandSize w:val="1"/>
       <w:tblStyleColBandSize w:val="1"/>
@@ -5527,6 +5693,9 @@
     <w:pPr>
       <w:spacing w:after="0" w:line="240" w:lineRule="auto"/>
     </w:pPr>
+    <w:rPr>
+      <w:rFonts w:ascii="Times New Roman" w:eastAsia="Times New Roman" w:hAnsi="Times New Roman" w:cs="Times New Roman"/>
+    </w:rPr>
     <w:tblPr>
       <w:tblStyleRowBandSize w:val="1"/>
       <w:tblStyleColBandSize w:val="1"/>
@@ -5669,6 +5838,9 @@
     <w:pPr>
       <w:spacing w:after="0" w:line="240" w:lineRule="auto"/>
     </w:pPr>
+    <w:rPr>
+      <w:rFonts w:ascii="Times New Roman" w:eastAsia="Times New Roman" w:hAnsi="Times New Roman" w:cs="Times New Roman"/>
+    </w:rPr>
     <w:tblPr>
       <w:tblStyleRowBandSize w:val="1"/>
       <w:tblStyleColBandSize w:val="1"/>
@@ -5811,6 +5983,9 @@
     <w:pPr>
       <w:spacing w:after="0" w:line="240" w:lineRule="auto"/>
     </w:pPr>
+    <w:rPr>
+      <w:rFonts w:ascii="Times New Roman" w:eastAsia="Times New Roman" w:hAnsi="Times New Roman" w:cs="Times New Roman"/>
+    </w:rPr>
     <w:tblPr>
       <w:tblStyleRowBandSize w:val="1"/>
       <w:tblStyleColBandSize w:val="1"/>
@@ -5953,6 +6128,9 @@
     <w:pPr>
       <w:spacing w:after="0" w:line="240" w:lineRule="auto"/>
     </w:pPr>
+    <w:rPr>
+      <w:rFonts w:ascii="Times New Roman" w:eastAsia="Times New Roman" w:hAnsi="Times New Roman" w:cs="Times New Roman"/>
+    </w:rPr>
     <w:tblPr>
       <w:tblStyleRowBandSize w:val="1"/>
       <w:tblStyleColBandSize w:val="1"/>
@@ -6095,6 +6273,9 @@
     <w:pPr>
       <w:spacing w:after="0" w:line="240" w:lineRule="auto"/>
     </w:pPr>
+    <w:rPr>
+      <w:rFonts w:ascii="Times New Roman" w:eastAsia="Times New Roman" w:hAnsi="Times New Roman" w:cs="Times New Roman"/>
+    </w:rPr>
     <w:tblPr>
       <w:tblStyleRowBandSize w:val="1"/>
       <w:tblStyleColBandSize w:val="1"/>
@@ -6237,6 +6418,9 @@
     <w:pPr>
       <w:spacing w:after="0" w:line="240" w:lineRule="auto"/>
     </w:pPr>
+    <w:rPr>
+      <w:rFonts w:ascii="Times New Roman" w:eastAsia="Times New Roman" w:hAnsi="Times New Roman" w:cs="Times New Roman"/>
+    </w:rPr>
     <w:tblPr>
       <w:tblStyleRowBandSize w:val="1"/>
       <w:tblStyleColBandSize w:val="1"/>
@@ -6380,6 +6564,7 @@
       <w:spacing w:after="0" w:line="240" w:lineRule="auto"/>
     </w:pPr>
     <w:rPr>
+      <w:rFonts w:ascii="Times New Roman" w:eastAsia="Times New Roman" w:hAnsi="Times New Roman" w:cs="Times New Roman"/>
       <w:color w:val="000000" w:themeColor="text1"/>
     </w:rPr>
     <w:tblPr>
@@ -6457,6 +6642,7 @@
       <w:spacing w:after="0" w:line="240" w:lineRule="auto"/>
     </w:pPr>
     <w:rPr>
+      <w:rFonts w:ascii="Times New Roman" w:eastAsia="Times New Roman" w:hAnsi="Times New Roman" w:cs="Times New Roman"/>
       <w:color w:val="000000" w:themeColor="text1"/>
     </w:rPr>
     <w:tblPr>
@@ -6534,6 +6720,7 @@
       <w:spacing w:after="0" w:line="240" w:lineRule="auto"/>
     </w:pPr>
     <w:rPr>
+      <w:rFonts w:ascii="Times New Roman" w:eastAsia="Times New Roman" w:hAnsi="Times New Roman" w:cs="Times New Roman"/>
       <w:color w:val="000000" w:themeColor="text1"/>
     </w:rPr>
     <w:tblPr>
@@ -6611,6 +6798,7 @@
       <w:spacing w:after="0" w:line="240" w:lineRule="auto"/>
     </w:pPr>
     <w:rPr>
+      <w:rFonts w:ascii="Times New Roman" w:eastAsia="Times New Roman" w:hAnsi="Times New Roman" w:cs="Times New Roman"/>
       <w:color w:val="000000" w:themeColor="text1"/>
     </w:rPr>
     <w:tblPr>
@@ -6688,6 +6876,7 @@
       <w:spacing w:after="0" w:line="240" w:lineRule="auto"/>
     </w:pPr>
     <w:rPr>
+      <w:rFonts w:ascii="Times New Roman" w:eastAsia="Times New Roman" w:hAnsi="Times New Roman" w:cs="Times New Roman"/>
       <w:color w:val="000000" w:themeColor="text1"/>
     </w:rPr>
     <w:tblPr>
@@ -6765,6 +6954,7 @@
       <w:spacing w:after="0" w:line="240" w:lineRule="auto"/>
     </w:pPr>
     <w:rPr>
+      <w:rFonts w:ascii="Times New Roman" w:eastAsia="Times New Roman" w:hAnsi="Times New Roman" w:cs="Times New Roman"/>
       <w:color w:val="000000" w:themeColor="text1"/>
     </w:rPr>
     <w:tblPr>
@@ -6842,6 +7032,7 @@
       <w:spacing w:after="0" w:line="240" w:lineRule="auto"/>
     </w:pPr>
     <w:rPr>
+      <w:rFonts w:ascii="Times New Roman" w:eastAsia="Times New Roman" w:hAnsi="Times New Roman" w:cs="Times New Roman"/>
       <w:color w:val="000000" w:themeColor="text1"/>
     </w:rPr>
     <w:tblPr>
@@ -6919,7 +7110,7 @@
       <w:spacing w:after="0" w:line="240" w:lineRule="auto"/>
     </w:pPr>
     <w:rPr>
-      <w:rFonts w:asciiTheme="majorHAnsi" w:eastAsiaTheme="majorEastAsia" w:hAnsiTheme="majorHAnsi" w:cstheme="majorBidi"/>
+      <w:rFonts w:ascii="Times New Roman" w:eastAsia="Times New Roman" w:hAnsi="Times New Roman" w:cs="Times New Roman"/>
       <w:color w:val="000000" w:themeColor="text1"/>
     </w:rPr>
     <w:tblPr>
@@ -7040,7 +7231,7 @@
       <w:spacing w:after="0" w:line="240" w:lineRule="auto"/>
     </w:pPr>
     <w:rPr>
-      <w:rFonts w:asciiTheme="majorHAnsi" w:eastAsiaTheme="majorEastAsia" w:hAnsiTheme="majorHAnsi" w:cstheme="majorBidi"/>
+      <w:rFonts w:ascii="Times New Roman" w:eastAsia="Times New Roman" w:hAnsi="Times New Roman" w:cs="Times New Roman"/>
       <w:color w:val="000000" w:themeColor="text1"/>
     </w:rPr>
     <w:tblPr>
@@ -7161,7 +7352,7 @@
       <w:spacing w:after="0" w:line="240" w:lineRule="auto"/>
     </w:pPr>
     <w:rPr>
-      <w:rFonts w:asciiTheme="majorHAnsi" w:eastAsiaTheme="majorEastAsia" w:hAnsiTheme="majorHAnsi" w:cstheme="majorBidi"/>
+      <w:rFonts w:ascii="Times New Roman" w:eastAsia="Times New Roman" w:hAnsi="Times New Roman" w:cs="Times New Roman"/>
       <w:color w:val="000000" w:themeColor="text1"/>
     </w:rPr>
     <w:tblPr>
@@ -7282,7 +7473,7 @@
       <w:spacing w:after="0" w:line="240" w:lineRule="auto"/>
     </w:pPr>
     <w:rPr>
-      <w:rFonts w:asciiTheme="majorHAnsi" w:eastAsiaTheme="majorEastAsia" w:hAnsiTheme="majorHAnsi" w:cstheme="majorBidi"/>
+      <w:rFonts w:ascii="Times New Roman" w:eastAsia="Times New Roman" w:hAnsi="Times New Roman" w:cs="Times New Roman"/>
       <w:color w:val="000000" w:themeColor="text1"/>
     </w:rPr>
     <w:tblPr>
@@ -7403,7 +7594,7 @@
       <w:spacing w:after="0" w:line="240" w:lineRule="auto"/>
     </w:pPr>
     <w:rPr>
-      <w:rFonts w:asciiTheme="majorHAnsi" w:eastAsiaTheme="majorEastAsia" w:hAnsiTheme="majorHAnsi" w:cstheme="majorBidi"/>
+      <w:rFonts w:ascii="Times New Roman" w:eastAsia="Times New Roman" w:hAnsi="Times New Roman" w:cs="Times New Roman"/>
       <w:color w:val="000000" w:themeColor="text1"/>
     </w:rPr>
     <w:tblPr>
@@ -7524,7 +7715,7 @@
       <w:spacing w:after="0" w:line="240" w:lineRule="auto"/>
     </w:pPr>
     <w:rPr>
-      <w:rFonts w:asciiTheme="majorHAnsi" w:eastAsiaTheme="majorEastAsia" w:hAnsiTheme="majorHAnsi" w:cstheme="majorBidi"/>
+      <w:rFonts w:ascii="Times New Roman" w:eastAsia="Times New Roman" w:hAnsi="Times New Roman" w:cs="Times New Roman"/>
       <w:color w:val="000000" w:themeColor="text1"/>
     </w:rPr>
     <w:tblPr>
@@ -7645,7 +7836,7 @@
       <w:spacing w:after="0" w:line="240" w:lineRule="auto"/>
     </w:pPr>
     <w:rPr>
-      <w:rFonts w:asciiTheme="majorHAnsi" w:eastAsiaTheme="majorEastAsia" w:hAnsiTheme="majorHAnsi" w:cstheme="majorBidi"/>
+      <w:rFonts w:ascii="Times New Roman" w:eastAsia="Times New Roman" w:hAnsi="Times New Roman" w:cs="Times New Roman"/>
       <w:color w:val="000000" w:themeColor="text1"/>
     </w:rPr>
     <w:tblPr>
@@ -7765,6 +7956,9 @@
     <w:pPr>
       <w:spacing w:after="0" w:line="240" w:lineRule="auto"/>
     </w:pPr>
+    <w:rPr>
+      <w:rFonts w:ascii="Times New Roman" w:eastAsia="Times New Roman" w:hAnsi="Times New Roman" w:cs="Times New Roman"/>
+    </w:rPr>
     <w:tblPr>
       <w:tblStyleRowBandSize w:val="1"/>
       <w:tblStyleColBandSize w:val="1"/>
@@ -7831,6 +8025,9 @@
     <w:pPr>
       <w:spacing w:after="0" w:line="240" w:lineRule="auto"/>
     </w:pPr>
+    <w:rPr>
+      <w:rFonts w:ascii="Times New Roman" w:eastAsia="Times New Roman" w:hAnsi="Times New Roman" w:cs="Times New Roman"/>
+    </w:rPr>
     <w:tblPr>
       <w:tblStyleRowBandSize w:val="1"/>
       <w:tblStyleColBandSize w:val="1"/>
@@ -7897,6 +8094,9 @@
     <w:pPr>
       <w:spacing w:after="0" w:line="240" w:lineRule="auto"/>
     </w:pPr>
+    <w:rPr>
+      <w:rFonts w:ascii="Times New Roman" w:eastAsia="Times New Roman" w:hAnsi="Times New Roman" w:cs="Times New Roman"/>
+    </w:rPr>
     <w:tblPr>
       <w:tblStyleRowBandSize w:val="1"/>
       <w:tblStyleColBandSize w:val="1"/>
@@ -7963,6 +8163,9 @@
     <w:pPr>
       <w:spacing w:after="0" w:line="240" w:lineRule="auto"/>
     </w:pPr>
+    <w:rPr>
+      <w:rFonts w:ascii="Times New Roman" w:eastAsia="Times New Roman" w:hAnsi="Times New Roman" w:cs="Times New Roman"/>
+    </w:rPr>
     <w:tblPr>
       <w:tblStyleRowBandSize w:val="1"/>
       <w:tblStyleColBandSize w:val="1"/>
@@ -8029,6 +8232,9 @@
     <w:pPr>
       <w:spacing w:after="0" w:line="240" w:lineRule="auto"/>
     </w:pPr>
+    <w:rPr>
+      <w:rFonts w:ascii="Times New Roman" w:eastAsia="Times New Roman" w:hAnsi="Times New Roman" w:cs="Times New Roman"/>
+    </w:rPr>
     <w:tblPr>
       <w:tblStyleRowBandSize w:val="1"/>
       <w:tblStyleColBandSize w:val="1"/>
@@ -8095,6 +8301,9 @@
     <w:pPr>
       <w:spacing w:after="0" w:line="240" w:lineRule="auto"/>
     </w:pPr>
+    <w:rPr>
+      <w:rFonts w:ascii="Times New Roman" w:eastAsia="Times New Roman" w:hAnsi="Times New Roman" w:cs="Times New Roman"/>
+    </w:rPr>
     <w:tblPr>
       <w:tblStyleRowBandSize w:val="1"/>
       <w:tblStyleColBandSize w:val="1"/>
@@ -8161,6 +8370,9 @@
     <w:pPr>
       <w:spacing w:after="0" w:line="240" w:lineRule="auto"/>
     </w:pPr>
+    <w:rPr>
+      <w:rFonts w:ascii="Times New Roman" w:eastAsia="Times New Roman" w:hAnsi="Times New Roman" w:cs="Times New Roman"/>
+    </w:rPr>
     <w:tblPr>
       <w:tblStyleRowBandSize w:val="1"/>
       <w:tblStyleColBandSize w:val="1"/>
@@ -8228,7 +8440,7 @@
       <w:spacing w:after="0" w:line="240" w:lineRule="auto"/>
     </w:pPr>
     <w:rPr>
-      <w:rFonts w:asciiTheme="majorHAnsi" w:eastAsiaTheme="majorEastAsia" w:hAnsiTheme="majorHAnsi" w:cstheme="majorBidi"/>
+      <w:rFonts w:ascii="Times New Roman" w:eastAsia="Times New Roman" w:hAnsi="Times New Roman" w:cs="Times New Roman"/>
       <w:color w:val="000000" w:themeColor="text1"/>
     </w:rPr>
     <w:tblPr>
@@ -8346,7 +8558,7 @@
       <w:spacing w:after="0" w:line="240" w:lineRule="auto"/>
     </w:pPr>
     <w:rPr>
-      <w:rFonts w:asciiTheme="majorHAnsi" w:eastAsiaTheme="majorEastAsia" w:hAnsiTheme="majorHAnsi" w:cstheme="majorBidi"/>
+      <w:rFonts w:ascii="Times New Roman" w:eastAsia="Times New Roman" w:hAnsi="Times New Roman" w:cs="Times New Roman"/>
       <w:color w:val="000000" w:themeColor="text1"/>
     </w:rPr>
     <w:tblPr>
@@ -8464,7 +8676,7 @@
       <w:spacing w:after="0" w:line="240" w:lineRule="auto"/>
     </w:pPr>
     <w:rPr>
-      <w:rFonts w:asciiTheme="majorHAnsi" w:eastAsiaTheme="majorEastAsia" w:hAnsiTheme="majorHAnsi" w:cstheme="majorBidi"/>
+      <w:rFonts w:ascii="Times New Roman" w:eastAsia="Times New Roman" w:hAnsi="Times New Roman" w:cs="Times New Roman"/>
       <w:color w:val="000000" w:themeColor="text1"/>
     </w:rPr>
     <w:tblPr>
@@ -8582,7 +8794,7 @@
       <w:spacing w:after="0" w:line="240" w:lineRule="auto"/>
     </w:pPr>
     <w:rPr>
-      <w:rFonts w:asciiTheme="majorHAnsi" w:eastAsiaTheme="majorEastAsia" w:hAnsiTheme="majorHAnsi" w:cstheme="majorBidi"/>
+      <w:rFonts w:ascii="Times New Roman" w:eastAsia="Times New Roman" w:hAnsi="Times New Roman" w:cs="Times New Roman"/>
       <w:color w:val="000000" w:themeColor="text1"/>
     </w:rPr>
     <w:tblPr>
@@ -8700,7 +8912,7 @@
       <w:spacing w:after="0" w:line="240" w:lineRule="auto"/>
     </w:pPr>
     <w:rPr>
-      <w:rFonts w:asciiTheme="majorHAnsi" w:eastAsiaTheme="majorEastAsia" w:hAnsiTheme="majorHAnsi" w:cstheme="majorBidi"/>
+      <w:rFonts w:ascii="Times New Roman" w:eastAsia="Times New Roman" w:hAnsi="Times New Roman" w:cs="Times New Roman"/>
       <w:color w:val="000000" w:themeColor="text1"/>
     </w:rPr>
     <w:tblPr>
@@ -8818,7 +9030,7 @@
       <w:spacing w:after="0" w:line="240" w:lineRule="auto"/>
     </w:pPr>
     <w:rPr>
-      <w:rFonts w:asciiTheme="majorHAnsi" w:eastAsiaTheme="majorEastAsia" w:hAnsiTheme="majorHAnsi" w:cstheme="majorBidi"/>
+      <w:rFonts w:ascii="Times New Roman" w:eastAsia="Times New Roman" w:hAnsi="Times New Roman" w:cs="Times New Roman"/>
       <w:color w:val="000000" w:themeColor="text1"/>
     </w:rPr>
     <w:tblPr>
@@ -8936,7 +9148,7 @@
       <w:spacing w:after="0" w:line="240" w:lineRule="auto"/>
     </w:pPr>
     <w:rPr>
-      <w:rFonts w:asciiTheme="majorHAnsi" w:eastAsiaTheme="majorEastAsia" w:hAnsiTheme="majorHAnsi" w:cstheme="majorBidi"/>
+      <w:rFonts w:ascii="Times New Roman" w:eastAsia="Times New Roman" w:hAnsi="Times New Roman" w:cs="Times New Roman"/>
       <w:color w:val="000000" w:themeColor="text1"/>
     </w:rPr>
     <w:tblPr>
@@ -9053,6 +9265,9 @@
     <w:pPr>
       <w:spacing w:after="0" w:line="240" w:lineRule="auto"/>
     </w:pPr>
+    <w:rPr>
+      <w:rFonts w:ascii="Times New Roman" w:eastAsia="Times New Roman" w:hAnsi="Times New Roman" w:cs="Times New Roman"/>
+    </w:rPr>
     <w:tblPr>
       <w:tblStyleRowBandSize w:val="1"/>
       <w:tblStyleColBandSize w:val="1"/>
@@ -9187,6 +9402,9 @@
     <w:pPr>
       <w:spacing w:after="0" w:line="240" w:lineRule="auto"/>
     </w:pPr>
+    <w:rPr>
+      <w:rFonts w:ascii="Times New Roman" w:eastAsia="Times New Roman" w:hAnsi="Times New Roman" w:cs="Times New Roman"/>
+    </w:rPr>
     <w:tblPr>
       <w:tblStyleRowBandSize w:val="1"/>
       <w:tblStyleColBandSize w:val="1"/>
@@ -9321,6 +9539,9 @@
     <w:pPr>
       <w:spacing w:after="0" w:line="240" w:lineRule="auto"/>
     </w:pPr>
+    <w:rPr>
+      <w:rFonts w:ascii="Times New Roman" w:eastAsia="Times New Roman" w:hAnsi="Times New Roman" w:cs="Times New Roman"/>
+    </w:rPr>
     <w:tblPr>
       <w:tblStyleRowBandSize w:val="1"/>
       <w:tblStyleColBandSize w:val="1"/>
@@ -9455,6 +9676,9 @@
     <w:pPr>
       <w:spacing w:after="0" w:line="240" w:lineRule="auto"/>
     </w:pPr>
+    <w:rPr>
+      <w:rFonts w:ascii="Times New Roman" w:eastAsia="Times New Roman" w:hAnsi="Times New Roman" w:cs="Times New Roman"/>
+    </w:rPr>
     <w:tblPr>
       <w:tblStyleRowBandSize w:val="1"/>
       <w:tblStyleColBandSize w:val="1"/>
@@ -9589,6 +9813,9 @@
     <w:pPr>
       <w:spacing w:after="0" w:line="240" w:lineRule="auto"/>
     </w:pPr>
+    <w:rPr>
+      <w:rFonts w:ascii="Times New Roman" w:eastAsia="Times New Roman" w:hAnsi="Times New Roman" w:cs="Times New Roman"/>
+    </w:rPr>
     <w:tblPr>
       <w:tblStyleRowBandSize w:val="1"/>
       <w:tblStyleColBandSize w:val="1"/>
@@ -9723,6 +9950,9 @@
     <w:pPr>
       <w:spacing w:after="0" w:line="240" w:lineRule="auto"/>
     </w:pPr>
+    <w:rPr>
+      <w:rFonts w:ascii="Times New Roman" w:eastAsia="Times New Roman" w:hAnsi="Times New Roman" w:cs="Times New Roman"/>
+    </w:rPr>
     <w:tblPr>
       <w:tblStyleRowBandSize w:val="1"/>
       <w:tblStyleColBandSize w:val="1"/>
@@ -9857,6 +10087,9 @@
     <w:pPr>
       <w:spacing w:after="0" w:line="240" w:lineRule="auto"/>
     </w:pPr>
+    <w:rPr>
+      <w:rFonts w:ascii="Times New Roman" w:eastAsia="Times New Roman" w:hAnsi="Times New Roman" w:cs="Times New Roman"/>
+    </w:rPr>
     <w:tblPr>
       <w:tblStyleRowBandSize w:val="1"/>
       <w:tblStyleColBandSize w:val="1"/>
@@ -9992,6 +10225,7 @@
       <w:spacing w:after="0" w:line="240" w:lineRule="auto"/>
     </w:pPr>
     <w:rPr>
+      <w:rFonts w:ascii="Times New Roman" w:eastAsia="Times New Roman" w:hAnsi="Times New Roman" w:cs="Times New Roman"/>
       <w:color w:val="FFFFFF" w:themeColor="background1"/>
     </w:rPr>
     <w:tblPr>
@@ -10099,6 +10333,7 @@
       <w:spacing w:after="0" w:line="240" w:lineRule="auto"/>
     </w:pPr>
     <w:rPr>
+      <w:rFonts w:ascii="Times New Roman" w:eastAsia="Times New Roman" w:hAnsi="Times New Roman" w:cs="Times New Roman"/>
       <w:color w:val="FFFFFF" w:themeColor="background1"/>
     </w:rPr>
     <w:tblPr>
@@ -10206,6 +10441,7 @@
       <w:spacing w:after="0" w:line="240" w:lineRule="auto"/>
     </w:pPr>
     <w:rPr>
+      <w:rFonts w:ascii="Times New Roman" w:eastAsia="Times New Roman" w:hAnsi="Times New Roman" w:cs="Times New Roman"/>
       <w:color w:val="FFFFFF" w:themeColor="background1"/>
     </w:rPr>
     <w:tblPr>
@@ -10313,6 +10549,7 @@
       <w:spacing w:after="0" w:line="240" w:lineRule="auto"/>
     </w:pPr>
     <w:rPr>
+      <w:rFonts w:ascii="Times New Roman" w:eastAsia="Times New Roman" w:hAnsi="Times New Roman" w:cs="Times New Roman"/>
       <w:color w:val="FFFFFF" w:themeColor="background1"/>
     </w:rPr>
     <w:tblPr>
@@ -10420,6 +10657,7 @@
       <w:spacing w:after="0" w:line="240" w:lineRule="auto"/>
     </w:pPr>
     <w:rPr>
+      <w:rFonts w:ascii="Times New Roman" w:eastAsia="Times New Roman" w:hAnsi="Times New Roman" w:cs="Times New Roman"/>
       <w:color w:val="FFFFFF" w:themeColor="background1"/>
     </w:rPr>
     <w:tblPr>
@@ -10527,6 +10765,7 @@
       <w:spacing w:after="0" w:line="240" w:lineRule="auto"/>
     </w:pPr>
     <w:rPr>
+      <w:rFonts w:ascii="Times New Roman" w:eastAsia="Times New Roman" w:hAnsi="Times New Roman" w:cs="Times New Roman"/>
       <w:color w:val="FFFFFF" w:themeColor="background1"/>
     </w:rPr>
     <w:tblPr>
@@ -10634,6 +10873,7 @@
       <w:spacing w:after="0" w:line="240" w:lineRule="auto"/>
     </w:pPr>
     <w:rPr>
+      <w:rFonts w:ascii="Times New Roman" w:eastAsia="Times New Roman" w:hAnsi="Times New Roman" w:cs="Times New Roman"/>
       <w:color w:val="FFFFFF" w:themeColor="background1"/>
     </w:rPr>
     <w:tblPr>
@@ -10741,6 +10981,7 @@
       <w:spacing w:after="0" w:line="240" w:lineRule="auto"/>
     </w:pPr>
     <w:rPr>
+      <w:rFonts w:ascii="Times New Roman" w:eastAsia="Times New Roman" w:hAnsi="Times New Roman" w:cs="Times New Roman"/>
       <w:color w:val="000000" w:themeColor="text1"/>
     </w:rPr>
     <w:tblPr>
@@ -10856,6 +11097,7 @@
       <w:spacing w:after="0" w:line="240" w:lineRule="auto"/>
     </w:pPr>
     <w:rPr>
+      <w:rFonts w:ascii="Times New Roman" w:eastAsia="Times New Roman" w:hAnsi="Times New Roman" w:cs="Times New Roman"/>
       <w:color w:val="000000" w:themeColor="text1"/>
     </w:rPr>
     <w:tblPr>
@@ -10971,6 +11213,7 @@
       <w:spacing w:after="0" w:line="240" w:lineRule="auto"/>
     </w:pPr>
     <w:rPr>
+      <w:rFonts w:ascii="Times New Roman" w:eastAsia="Times New Roman" w:hAnsi="Times New Roman" w:cs="Times New Roman"/>
       <w:color w:val="000000" w:themeColor="text1"/>
     </w:rPr>
     <w:tblPr>
@@ -11086,6 +11329,7 @@
       <w:spacing w:after="0" w:line="240" w:lineRule="auto"/>
     </w:pPr>
     <w:rPr>
+      <w:rFonts w:ascii="Times New Roman" w:eastAsia="Times New Roman" w:hAnsi="Times New Roman" w:cs="Times New Roman"/>
       <w:color w:val="000000" w:themeColor="text1"/>
     </w:rPr>
     <w:tblPr>
@@ -11191,6 +11435,7 @@
       <w:spacing w:after="0" w:line="240" w:lineRule="auto"/>
     </w:pPr>
     <w:rPr>
+      <w:rFonts w:ascii="Times New Roman" w:eastAsia="Times New Roman" w:hAnsi="Times New Roman" w:cs="Times New Roman"/>
       <w:color w:val="000000" w:themeColor="text1"/>
     </w:rPr>
     <w:tblPr>
@@ -11306,6 +11551,7 @@
       <w:spacing w:after="0" w:line="240" w:lineRule="auto"/>
     </w:pPr>
     <w:rPr>
+      <w:rFonts w:ascii="Times New Roman" w:eastAsia="Times New Roman" w:hAnsi="Times New Roman" w:cs="Times New Roman"/>
       <w:color w:val="000000" w:themeColor="text1"/>
     </w:rPr>
     <w:tblPr>
@@ -11421,6 +11667,7 @@
       <w:spacing w:after="0" w:line="240" w:lineRule="auto"/>
     </w:pPr>
     <w:rPr>
+      <w:rFonts w:ascii="Times New Roman" w:eastAsia="Times New Roman" w:hAnsi="Times New Roman" w:cs="Times New Roman"/>
       <w:color w:val="000000" w:themeColor="text1"/>
     </w:rPr>
     <w:tblPr>
@@ -11536,6 +11783,7 @@
       <w:spacing w:after="0" w:line="240" w:lineRule="auto"/>
     </w:pPr>
     <w:rPr>
+      <w:rFonts w:ascii="Times New Roman" w:eastAsia="Times New Roman" w:hAnsi="Times New Roman" w:cs="Times New Roman"/>
       <w:color w:val="000000" w:themeColor="text1"/>
     </w:rPr>
     <w:tblPr>
@@ -11615,6 +11863,7 @@
       <w:spacing w:after="0" w:line="240" w:lineRule="auto"/>
     </w:pPr>
     <w:rPr>
+      <w:rFonts w:ascii="Times New Roman" w:eastAsia="Times New Roman" w:hAnsi="Times New Roman" w:cs="Times New Roman"/>
       <w:color w:val="000000" w:themeColor="text1"/>
     </w:rPr>
     <w:tblPr>
@@ -11694,6 +11943,7 @@
       <w:spacing w:after="0" w:line="240" w:lineRule="auto"/>
     </w:pPr>
     <w:rPr>
+      <w:rFonts w:ascii="Times New Roman" w:eastAsia="Times New Roman" w:hAnsi="Times New Roman" w:cs="Times New Roman"/>
       <w:color w:val="000000" w:themeColor="text1"/>
     </w:rPr>
     <w:tblPr>
@@ -11773,6 +12023,7 @@
       <w:spacing w:after="0" w:line="240" w:lineRule="auto"/>
     </w:pPr>
     <w:rPr>
+      <w:rFonts w:ascii="Times New Roman" w:eastAsia="Times New Roman" w:hAnsi="Times New Roman" w:cs="Times New Roman"/>
       <w:color w:val="000000" w:themeColor="text1"/>
     </w:rPr>
     <w:tblPr>
@@ -11852,6 +12103,7 @@
       <w:spacing w:after="0" w:line="240" w:lineRule="auto"/>
     </w:pPr>
     <w:rPr>
+      <w:rFonts w:ascii="Times New Roman" w:eastAsia="Times New Roman" w:hAnsi="Times New Roman" w:cs="Times New Roman"/>
       <w:color w:val="000000" w:themeColor="text1"/>
     </w:rPr>
     <w:tblPr>
@@ -11931,6 +12183,7 @@
       <w:spacing w:after="0" w:line="240" w:lineRule="auto"/>
     </w:pPr>
     <w:rPr>
+      <w:rFonts w:ascii="Times New Roman" w:eastAsia="Times New Roman" w:hAnsi="Times New Roman" w:cs="Times New Roman"/>
       <w:color w:val="000000" w:themeColor="text1"/>
     </w:rPr>
     <w:tblPr>
@@ -12010,6 +12263,7 @@
       <w:spacing w:after="0" w:line="240" w:lineRule="auto"/>
     </w:pPr>
     <w:rPr>
+      <w:rFonts w:ascii="Times New Roman" w:eastAsia="Times New Roman" w:hAnsi="Times New Roman" w:cs="Times New Roman"/>
       <w:color w:val="000000" w:themeColor="text1"/>
     </w:rPr>
     <w:tblPr>
@@ -12089,6 +12343,7 @@
       <w:spacing w:after="0" w:line="240" w:lineRule="auto"/>
     </w:pPr>
     <w:rPr>
+      <w:rFonts w:ascii="Times New Roman" w:eastAsia="Times New Roman" w:hAnsi="Times New Roman" w:cs="Times New Roman"/>
       <w:color w:val="000000" w:themeColor="text1"/>
     </w:rPr>
     <w:tblPr>
@@ -12162,6 +12417,7 @@
       <w:spacing w:after="0" w:line="240" w:lineRule="auto"/>
     </w:pPr>
     <w:rPr>
+      <w:rFonts w:ascii="Times New Roman" w:eastAsia="Times New Roman" w:hAnsi="Times New Roman" w:cs="Times New Roman"/>
       <w:color w:val="000000" w:themeColor="text1"/>
     </w:rPr>
     <w:tblPr>
@@ -12235,6 +12491,7 @@
       <w:spacing w:after="0" w:line="240" w:lineRule="auto"/>
     </w:pPr>
     <w:rPr>
+      <w:rFonts w:ascii="Times New Roman" w:eastAsia="Times New Roman" w:hAnsi="Times New Roman" w:cs="Times New Roman"/>
       <w:color w:val="000000" w:themeColor="text1"/>
     </w:rPr>
     <w:tblPr>
@@ -12308,6 +12565,7 @@
       <w:spacing w:after="0" w:line="240" w:lineRule="auto"/>
     </w:pPr>
     <w:rPr>
+      <w:rFonts w:ascii="Times New Roman" w:eastAsia="Times New Roman" w:hAnsi="Times New Roman" w:cs="Times New Roman"/>
       <w:color w:val="000000" w:themeColor="text1"/>
     </w:rPr>
     <w:tblPr>
@@ -12381,6 +12639,7 @@
       <w:spacing w:after="0" w:line="240" w:lineRule="auto"/>
     </w:pPr>
     <w:rPr>
+      <w:rFonts w:ascii="Times New Roman" w:eastAsia="Times New Roman" w:hAnsi="Times New Roman" w:cs="Times New Roman"/>
       <w:color w:val="000000" w:themeColor="text1"/>
     </w:rPr>
     <w:tblPr>
@@ -12454,6 +12713,7 @@
       <w:spacing w:after="0" w:line="240" w:lineRule="auto"/>
     </w:pPr>
     <w:rPr>
+      <w:rFonts w:ascii="Times New Roman" w:eastAsia="Times New Roman" w:hAnsi="Times New Roman" w:cs="Times New Roman"/>
       <w:color w:val="000000" w:themeColor="text1"/>
     </w:rPr>
     <w:tblPr>
@@ -12527,6 +12787,7 @@
       <w:spacing w:after="0" w:line="240" w:lineRule="auto"/>
     </w:pPr>
     <w:rPr>
+      <w:rFonts w:ascii="Times New Roman" w:eastAsia="Times New Roman" w:hAnsi="Times New Roman" w:cs="Times New Roman"/>
       <w:color w:val="000000" w:themeColor="text1"/>
     </w:rPr>
     <w:tblPr>
@@ -12602,7 +12863,6 @@
       <w:spacing w:before="100" w:beforeAutospacing="1" w:after="100" w:afterAutospacing="1" w:line="240" w:lineRule="auto"/>
     </w:pPr>
     <w:rPr>
-      <w:rFonts w:ascii="Times New Roman" w:eastAsia="Times New Roman" w:hAnsi="Times New Roman" w:cs="Times New Roman"/>
       <w:sz w:val="24"/>
       <w:szCs w:val="24"/>
     </w:rPr>

</xml_diff>